<commit_message>
javadoc menuCliente + modifica man t.
</commit_message>
<xml_diff>
--- a/doc/Manuale Tecnico.docx
+++ b/doc/Manuale Tecnico.docx
@@ -53,23 +53,13 @@
         <w:rPr>
           <w:rFonts w:eastAsia="Times New Roman"/>
         </w:rPr>
-        <w:t xml:space="preserve"> Arianna, 16/09/2026, versione </w:t>
-      </w:r>
-      <w:proofErr w:type="spellStart"/>
+        <w:t xml:space="preserve"> Arianna, 16/09/2026, versione</w:t>
+      </w:r>
       <w:r>
         <w:rPr>
           <w:rFonts w:eastAsia="Times New Roman"/>
-          <w:highlight w:val="yellow"/>
-        </w:rPr>
-        <w:t>Versione</w:t>
-      </w:r>
-      <w:proofErr w:type="spellEnd"/>
-      <w:r>
-        <w:rPr>
-          <w:rFonts w:eastAsia="Times New Roman"/>
-          <w:highlight w:val="yellow"/>
-        </w:rPr>
-        <w:t xml:space="preserve"> documento</w:t>
+        </w:rPr>
+        <w:t xml:space="preserve"> 2.1</w:t>
       </w:r>
       <w:r>
         <w:rPr>
@@ -883,30 +873,20 @@
         <w:t xml:space="preserve">Il primo costruttore si occupa di creare un oggetto di tipo “Utente” inizializzando i campi della classe: in particolare, il campo “ID”, che rappresenta il codice identificativo dell’utente, è inizializzato con un numero progressivo, assegnato dal metodo </w:t>
       </w:r>
       <w:proofErr w:type="spellStart"/>
-      <w:proofErr w:type="gramStart"/>
       <w:r>
         <w:t>generaID</w:t>
       </w:r>
       <w:proofErr w:type="spellEnd"/>
       <w:r>
-        <w:t>(</w:t>
-      </w:r>
-      <w:proofErr w:type="gramEnd"/>
-      <w:r>
-        <w:t xml:space="preserve">) ogni volta che viene aggiunto in coda un utente al file “Utenti.csv”. È stato scelto in precedenza di utilizzare la combinazione di username e password per identificare un utente ma non si è rivelato un metodo abbastanza solido per via della presenza di utenti con medesime credenziali; inoltre la password viene subito cifrata con il metodo statico </w:t>
-      </w:r>
-      <w:proofErr w:type="spellStart"/>
-      <w:proofErr w:type="gramStart"/>
+        <w:t xml:space="preserve">() ogni volta che viene aggiunto in coda un utente al file “Utenti.csv”. È stato scelto in precedenza di utilizzare la combinazione di username e password per identificare un utente ma non si è rivelato un metodo abbastanza solido per via della presenza di utenti con medesime credenziali; inoltre la password viene subito cifrata con il metodo statico </w:t>
+      </w:r>
+      <w:proofErr w:type="spellStart"/>
       <w:r>
         <w:t>passwordHash</w:t>
       </w:r>
       <w:proofErr w:type="spellEnd"/>
       <w:r>
-        <w:t>(</w:t>
-      </w:r>
-      <w:proofErr w:type="gramEnd"/>
-      <w:r>
-        <w:t>) della classe stessa e il valore restituito è memorizzato al campo password.</w:t>
+        <w:t>() della classe stessa e il valore restituito è memorizzato al campo password.</w:t>
       </w:r>
     </w:p>
     <w:p>
@@ -923,17 +903,12 @@
         <w:t xml:space="preserve">Metodo </w:t>
       </w:r>
       <w:proofErr w:type="spellStart"/>
-      <w:proofErr w:type="gramStart"/>
       <w:r>
         <w:t>generaID</w:t>
       </w:r>
       <w:proofErr w:type="spellEnd"/>
       <w:r>
-        <w:t>(</w:t>
-      </w:r>
-      <w:proofErr w:type="gramEnd"/>
-      <w:r>
-        <w:t>)</w:t>
+        <w:t>()</w:t>
       </w:r>
     </w:p>
     <w:p>
@@ -943,23 +918,7 @@
     </w:p>
     <w:p>
       <w:r>
-        <w:t>Viene utilizzato un vettore di tipo String denominato “dati” che suddivide ogni stringa letta dal file “Utenti.csv” in elementi e viene preso in considerazione l’elemento “</w:t>
-      </w:r>
-      <w:proofErr w:type="gramStart"/>
-      <w:r>
-        <w:t>dati[</w:t>
-      </w:r>
-      <w:proofErr w:type="gramEnd"/>
-      <w:r>
-        <w:t xml:space="preserve">0]”, ovvero il codice ID e in un istante successivo il valore di </w:t>
-      </w:r>
-      <w:proofErr w:type="gramStart"/>
-      <w:r>
-        <w:t>dati[</w:t>
-      </w:r>
-      <w:proofErr w:type="gramEnd"/>
-      <w:r>
-        <w:t>0] è incrementato di uno.</w:t>
+        <w:t>Viene utilizzato un vettore di tipo String denominato “dati” che suddivide ogni stringa letta dal file “Utenti.csv” in elementi e viene preso in considerazione l’elemento “dati[0]”, ovvero il codice ID e in un istante successivo il valore di dati[0] è incrementato di uno.</w:t>
       </w:r>
     </w:p>
     <w:p>
@@ -983,17 +942,12 @@
         <w:t xml:space="preserve">Metodo </w:t>
       </w:r>
       <w:proofErr w:type="spellStart"/>
-      <w:proofErr w:type="gramStart"/>
       <w:r>
         <w:t>getUtente</w:t>
       </w:r>
       <w:proofErr w:type="spellEnd"/>
       <w:r>
-        <w:t>(</w:t>
-      </w:r>
-      <w:proofErr w:type="gramEnd"/>
-      <w:r>
-        <w:t>)</w:t>
+        <w:t>()</w:t>
       </w:r>
     </w:p>
     <w:p>
@@ -1001,17 +955,12 @@
         <w:t xml:space="preserve">La classe Utente dispone del metodo </w:t>
       </w:r>
       <w:proofErr w:type="spellStart"/>
-      <w:proofErr w:type="gramStart"/>
       <w:r>
         <w:t>getUtente</w:t>
       </w:r>
       <w:proofErr w:type="spellEnd"/>
       <w:r>
-        <w:t>(</w:t>
-      </w:r>
-      <w:proofErr w:type="gramEnd"/>
-      <w:r>
-        <w:t>) per ottenere un oggetto di tipo Utente fornendo come parametro il proprio codice ID. Questo metodo è stato implementato per facilitare la creazione di un Utente, evitando di dover manualmente fornire un valore a tutti i campi della classe al medesimo scopo di ottenere l’oggetto.</w:t>
+        <w:t>() per ottenere un oggetto di tipo Utente fornendo come parametro il proprio codice ID. Questo metodo è stato implementato per facilitare la creazione di un Utente, evitando di dover manualmente fornire un valore a tutti i campi della classe al medesimo scopo di ottenere l’oggetto.</w:t>
       </w:r>
     </w:p>
     <w:p>
@@ -1026,15 +975,7 @@
     </w:p>
     <w:p>
       <w:r>
-        <w:t xml:space="preserve">Per ogni riga letta dal file, il metodo confronta l’elemento </w:t>
-      </w:r>
-      <w:proofErr w:type="gramStart"/>
-      <w:r>
-        <w:t>dati[</w:t>
-      </w:r>
-      <w:proofErr w:type="gramEnd"/>
-      <w:r>
-        <w:t>0], rappresentante il codice identificativo con l’ID passato in argomento. Se i due valori coincidono, viene creato un oggetto di tipo Utente.</w:t>
+        <w:t>Per ogni riga letta dal file, il metodo confronta l’elemento dati[0], rappresentante il codice identificativo con l’ID passato in argomento. Se i due valori coincidono, viene creato un oggetto di tipo Utente.</w:t>
       </w:r>
     </w:p>
     <w:p>
@@ -1095,17 +1036,12 @@
         <w:t xml:space="preserve">Metodo </w:t>
       </w:r>
       <w:proofErr w:type="spellStart"/>
-      <w:proofErr w:type="gramStart"/>
       <w:r>
         <w:t>registraUtente</w:t>
       </w:r>
       <w:proofErr w:type="spellEnd"/>
       <w:r>
-        <w:t>(</w:t>
-      </w:r>
-      <w:proofErr w:type="gramEnd"/>
-      <w:r>
-        <w:t>)</w:t>
+        <w:t>()</w:t>
       </w:r>
     </w:p>
     <w:p>
@@ -1113,17 +1049,12 @@
         <w:t xml:space="preserve">Il metodo </w:t>
       </w:r>
       <w:proofErr w:type="spellStart"/>
-      <w:proofErr w:type="gramStart"/>
       <w:r>
         <w:t>registraUtente</w:t>
       </w:r>
       <w:proofErr w:type="spellEnd"/>
       <w:r>
-        <w:t>(</w:t>
-      </w:r>
-      <w:proofErr w:type="gramEnd"/>
-      <w:r>
-        <w:t>) si occupa, ricevuto un oggetto di tipo utente come parametro, di fornirne una rappresentazione testuale e di memorizzarlo come una nuova riga aggiunta in coda al file Utenti.csv.</w:t>
+        <w:t>() si occupa, ricevuto un oggetto di tipo utente come parametro, di fornirne una rappresentazione testuale e di memorizzarlo come una nuova riga aggiunta in coda al file Utenti.csv.</w:t>
       </w:r>
     </w:p>
     <w:p>
@@ -1131,17 +1062,12 @@
         <w:t xml:space="preserve">La rappresentazione testuale dell’utente è fornita dal metodo </w:t>
       </w:r>
       <w:proofErr w:type="spellStart"/>
-      <w:proofErr w:type="gramStart"/>
       <w:r>
         <w:t>toString</w:t>
       </w:r>
       <w:proofErr w:type="spellEnd"/>
       <w:r>
-        <w:t>(</w:t>
-      </w:r>
-      <w:proofErr w:type="gramEnd"/>
-      <w:r>
-        <w:t>).</w:t>
+        <w:t>().</w:t>
       </w:r>
     </w:p>
     <w:p>
@@ -1180,17 +1106,12 @@
         </w:numPr>
       </w:pPr>
       <w:proofErr w:type="spellStart"/>
-      <w:proofErr w:type="gramStart"/>
       <w:r>
         <w:t>getID</w:t>
       </w:r>
       <w:proofErr w:type="spellEnd"/>
       <w:r>
-        <w:t>(</w:t>
-      </w:r>
-      <w:proofErr w:type="gramEnd"/>
-      <w:r>
-        <w:t>);</w:t>
+        <w:t>();</w:t>
       </w:r>
     </w:p>
     <w:p>
@@ -1202,17 +1123,12 @@
         </w:numPr>
       </w:pPr>
       <w:proofErr w:type="spellStart"/>
-      <w:proofErr w:type="gramStart"/>
       <w:r>
         <w:t>getNome</w:t>
       </w:r>
       <w:proofErr w:type="spellEnd"/>
       <w:r>
-        <w:t>(</w:t>
-      </w:r>
-      <w:proofErr w:type="gramEnd"/>
-      <w:r>
-        <w:t>);</w:t>
+        <w:t>();</w:t>
       </w:r>
     </w:p>
     <w:p>
@@ -1224,17 +1140,12 @@
         </w:numPr>
       </w:pPr>
       <w:proofErr w:type="spellStart"/>
-      <w:proofErr w:type="gramStart"/>
       <w:r>
         <w:t>getCognome</w:t>
       </w:r>
       <w:proofErr w:type="spellEnd"/>
       <w:r>
-        <w:t>(</w:t>
-      </w:r>
-      <w:proofErr w:type="gramEnd"/>
-      <w:r>
-        <w:t>);</w:t>
+        <w:t>();</w:t>
       </w:r>
     </w:p>
     <w:p>
@@ -1246,17 +1157,12 @@
         </w:numPr>
       </w:pPr>
       <w:proofErr w:type="spellStart"/>
-      <w:proofErr w:type="gramStart"/>
       <w:r>
         <w:t>getUsername</w:t>
       </w:r>
       <w:proofErr w:type="spellEnd"/>
       <w:r>
-        <w:t>(</w:t>
-      </w:r>
-      <w:proofErr w:type="gramEnd"/>
-      <w:r>
-        <w:t>);</w:t>
+        <w:t>();</w:t>
       </w:r>
     </w:p>
     <w:p>
@@ -1268,17 +1174,12 @@
         </w:numPr>
       </w:pPr>
       <w:proofErr w:type="spellStart"/>
-      <w:proofErr w:type="gramStart"/>
       <w:r>
         <w:t>getPassword</w:t>
       </w:r>
       <w:proofErr w:type="spellEnd"/>
       <w:r>
-        <w:t>(</w:t>
-      </w:r>
-      <w:proofErr w:type="gramEnd"/>
-      <w:r>
-        <w:t>): ha il modificatore di visibilità dichiarato “private” in modo che la password, nonostante cifrata, resti inaccessibile alle altre classi per ragioni di sicurezza;</w:t>
+        <w:t>(): ha il modificatore di visibilità dichiarato “private” in modo che la password, nonostante cifrata, resti inaccessibile alle altre classi per ragioni di sicurezza;</w:t>
       </w:r>
     </w:p>
     <w:p>
@@ -1290,17 +1191,12 @@
         </w:numPr>
       </w:pPr>
       <w:proofErr w:type="spellStart"/>
-      <w:proofErr w:type="gramStart"/>
       <w:r>
         <w:t>getDataNascita</w:t>
       </w:r>
       <w:proofErr w:type="spellEnd"/>
       <w:r>
-        <w:t>(</w:t>
-      </w:r>
-      <w:proofErr w:type="gramEnd"/>
-      <w:r>
-        <w:t>);</w:t>
+        <w:t>();</w:t>
       </w:r>
     </w:p>
     <w:p>
@@ -1312,17 +1208,12 @@
         </w:numPr>
       </w:pPr>
       <w:proofErr w:type="spellStart"/>
-      <w:proofErr w:type="gramStart"/>
       <w:r>
         <w:t>getDomicilio</w:t>
       </w:r>
       <w:proofErr w:type="spellEnd"/>
       <w:r>
-        <w:t>(</w:t>
-      </w:r>
-      <w:proofErr w:type="gramEnd"/>
-      <w:r>
-        <w:t>);</w:t>
+        <w:t>();</w:t>
       </w:r>
     </w:p>
     <w:p>
@@ -1334,17 +1225,12 @@
         </w:numPr>
       </w:pPr>
       <w:proofErr w:type="spellStart"/>
-      <w:proofErr w:type="gramStart"/>
       <w:r>
         <w:t>getRuolo</w:t>
       </w:r>
       <w:proofErr w:type="spellEnd"/>
       <w:r>
-        <w:t>(</w:t>
-      </w:r>
-      <w:proofErr w:type="gramEnd"/>
-      <w:r>
-        <w:t>).</w:t>
+        <w:t>().</w:t>
       </w:r>
     </w:p>
     <w:p>
@@ -1355,17 +1241,12 @@
         <w:t xml:space="preserve">Metodo </w:t>
       </w:r>
       <w:proofErr w:type="spellStart"/>
-      <w:proofErr w:type="gramStart"/>
       <w:r>
         <w:t>toString</w:t>
       </w:r>
       <w:proofErr w:type="spellEnd"/>
       <w:r>
-        <w:t>(</w:t>
-      </w:r>
-      <w:proofErr w:type="gramEnd"/>
-      <w:r>
-        <w:t>)</w:t>
+        <w:t>()</w:t>
       </w:r>
     </w:p>
     <w:p>
@@ -1381,17 +1262,12 @@
         <w:t xml:space="preserve">Metodo </w:t>
       </w:r>
       <w:proofErr w:type="spellStart"/>
-      <w:proofErr w:type="gramStart"/>
       <w:r>
         <w:t>passwordHash</w:t>
       </w:r>
       <w:proofErr w:type="spellEnd"/>
       <w:r>
-        <w:t>(</w:t>
-      </w:r>
-      <w:proofErr w:type="gramEnd"/>
-      <w:r>
-        <w:t>)</w:t>
+        <w:t>()</w:t>
       </w:r>
     </w:p>
     <w:p>
@@ -1454,17 +1330,12 @@
         <w:t xml:space="preserve">Il metodo </w:t>
       </w:r>
       <w:proofErr w:type="spellStart"/>
-      <w:proofErr w:type="gramStart"/>
       <w:r>
         <w:t>passwordHash</w:t>
       </w:r>
       <w:proofErr w:type="spellEnd"/>
       <w:r>
-        <w:t>(</w:t>
-      </w:r>
-      <w:proofErr w:type="gramEnd"/>
-      <w:r>
-        <w:t>) codifica le password in modo irreversibile: dispone soltanto la funzione di codifica (non di decodifica) aumentando la sicurezza delle password stesse in confronto a un qualsiasi altro metodo di codifica reversibile.</w:t>
+        <w:t>() codifica le password in modo irreversibile: dispone soltanto la funzione di codifica (non di decodifica) aumentando la sicurezza delle password stesse in confronto a un qualsiasi altro metodo di codifica reversibile.</w:t>
       </w:r>
     </w:p>
     <w:p>
@@ -1478,12 +1349,10 @@
         <w:t>, il frammento di codice “</w:t>
       </w:r>
       <w:proofErr w:type="spellStart"/>
-      <w:proofErr w:type="gramStart"/>
       <w:r>
         <w:t>hex.length</w:t>
       </w:r>
       <w:proofErr w:type="spellEnd"/>
-      <w:proofErr w:type="gramEnd"/>
       <w:r>
         <w:t>() == 1</w:t>
       </w:r>
@@ -1601,17 +1470,12 @@
         <w:t xml:space="preserve">Il costruttore, ricevendo come parametri “username” e “password” passati dall’utente, si occupa di creare un oggetto di tipo Login costituito dai campi “username” e, andando a cifrare la password servendosi del metodo </w:t>
       </w:r>
       <w:proofErr w:type="spellStart"/>
-      <w:proofErr w:type="gramStart"/>
       <w:r>
         <w:t>passwordHash</w:t>
       </w:r>
       <w:proofErr w:type="spellEnd"/>
       <w:r>
-        <w:t>(</w:t>
-      </w:r>
-      <w:proofErr w:type="gramEnd"/>
-      <w:r>
-        <w:t>) della classe Utente, dal campo “password”.</w:t>
+        <w:t>() della classe Utente, dal campo “password”.</w:t>
       </w:r>
     </w:p>
     <w:p>
@@ -1624,36 +1488,15 @@
     </w:p>
     <w:p>
       <w:r>
-        <w:t>I metodi “</w:t>
-      </w:r>
-      <w:proofErr w:type="gramStart"/>
-      <w:r>
-        <w:t>getter(</w:t>
-      </w:r>
-      <w:proofErr w:type="gramEnd"/>
-      <w:r>
-        <w:t>)” con modificatore di visibilità “public” sono stati implementati affinché le altre classi possono avere accesso ai campi della classe Login dichiarati “private”; l’unico metodo “</w:t>
-      </w:r>
-      <w:proofErr w:type="gramStart"/>
-      <w:r>
-        <w:t>getter(</w:t>
-      </w:r>
-      <w:proofErr w:type="gramEnd"/>
-      <w:r>
-        <w:t xml:space="preserve">)” con modificatore di visibilità “private” è </w:t>
-      </w:r>
-      <w:proofErr w:type="spellStart"/>
-      <w:proofErr w:type="gramStart"/>
+        <w:t xml:space="preserve">I metodi “getter()” con modificatore di visibilità “public” sono stati implementati affinché le altre classi possono avere accesso ai campi della classe Login dichiarati “private”; l’unico metodo “getter()” con modificatore di visibilità “private” è </w:t>
+      </w:r>
+      <w:proofErr w:type="spellStart"/>
       <w:r>
         <w:t>getPassword</w:t>
       </w:r>
       <w:proofErr w:type="spellEnd"/>
       <w:r>
-        <w:t>(</w:t>
-      </w:r>
-      <w:proofErr w:type="gramEnd"/>
-      <w:r>
-        <w:t>), che non permette alle altre classi di ottenere il valore del campo “password” (cifrato).</w:t>
+        <w:t>(), che non permette alle altre classi di ottenere il valore del campo “password” (cifrato).</w:t>
       </w:r>
     </w:p>
     <w:p>
@@ -1661,67 +1504,25 @@
         <w:pStyle w:val="Titolo"/>
       </w:pPr>
       <w:r>
-        <w:t xml:space="preserve">Metodo </w:t>
-      </w:r>
-      <w:proofErr w:type="gramStart"/>
-      <w:r>
-        <w:t>login(</w:t>
-      </w:r>
-      <w:proofErr w:type="gramEnd"/>
-      <w:r>
-        <w:t>)</w:t>
-      </w:r>
-    </w:p>
-    <w:p>
-      <w:r>
-        <w:t xml:space="preserve">La classe Login dispone di un metodo statico </w:t>
-      </w:r>
-      <w:proofErr w:type="gramStart"/>
-      <w:r>
-        <w:t>login(</w:t>
-      </w:r>
-      <w:proofErr w:type="gramEnd"/>
-      <w:r>
-        <w:t xml:space="preserve">) che ritorna un oggetto di tipo Utente. Questo metodo si serve delle credenziali di accesso di un utente già registrato per istanziare un oggetto di tipo Utente, il quale verrà salvato nel metodo </w:t>
-      </w:r>
-      <w:proofErr w:type="spellStart"/>
-      <w:proofErr w:type="gramStart"/>
+        <w:t>Metodo login()</w:t>
+      </w:r>
+    </w:p>
+    <w:p>
+      <w:r>
+        <w:t xml:space="preserve">La classe Login dispone di un metodo statico login() che ritorna un oggetto di tipo Utente. Questo metodo si serve delle credenziali di accesso di un utente già registrato per istanziare un oggetto di tipo Utente, il quale verrà salvato nel metodo </w:t>
+      </w:r>
+      <w:proofErr w:type="spellStart"/>
       <w:r>
         <w:t>main</w:t>
       </w:r>
       <w:proofErr w:type="spellEnd"/>
       <w:r>
-        <w:t>(</w:t>
-      </w:r>
-      <w:proofErr w:type="gramEnd"/>
-      <w:r>
-        <w:t>) tramite una variabile globale che punterà all’oggetto in questione, in modo tale che nei metodi che richiedono tra i parametri formali un Utente, quest’ultimo venga passato senza la necessità che l’utente si identifichi ogni qual volta desideri compiere un’azione tra quelle disponibili per il proprio ruolo.</w:t>
-      </w:r>
-    </w:p>
-    <w:p>
-      <w:proofErr w:type="gramStart"/>
-      <w:r>
-        <w:t>login(</w:t>
-      </w:r>
-      <w:proofErr w:type="gramEnd"/>
-      <w:r>
-        <w:t xml:space="preserve">) è collegato al file di testo “Utenti.csv”; legge riga per riga dal file confrontando username e password (memorizzati in un oggetto di tipo Login) passati in argomento con quelli memorizzati nel file. Il metodo si occupa, ad ogni riga letta, di dividerla (tramite il separatore di elementi “,”) nella struttura dati vettore “dati” di tipo “String” in modo da fornire una posizione numerica agli elementi che lo compongono: “username” e “password” memorizzati nel file si trovano rispettivamente alle posizioni </w:t>
-      </w:r>
-      <w:proofErr w:type="gramStart"/>
-      <w:r>
-        <w:t>dati[</w:t>
-      </w:r>
-      <w:proofErr w:type="gramEnd"/>
-      <w:r>
-        <w:t xml:space="preserve">3] e </w:t>
-      </w:r>
-      <w:proofErr w:type="gramStart"/>
-      <w:r>
-        <w:t>dati[</w:t>
-      </w:r>
-      <w:proofErr w:type="gramEnd"/>
-      <w:r>
-        <w:t>4]. Per quanto riguarda il confronto delle password, il metodo confronta le password cifrate mentre la valutazione della coincidenza degli username avviene in chiaro.</w:t>
+        <w:t>() tramite una variabile globale che punterà all’oggetto in questione, in modo tale che nei metodi che richiedono tra i parametri formali un Utente, quest’ultimo venga passato senza la necessità che l’utente si identifichi ogni qual volta desideri compiere un’azione tra quelle disponibili per il proprio ruolo.</w:t>
+      </w:r>
+    </w:p>
+    <w:p>
+      <w:r>
+        <w:t>login() è collegato al file di testo “Utenti.csv”; legge riga per riga dal file confrontando username e password (memorizzati in un oggetto di tipo Login) passati in argomento con quelli memorizzati nel file. Il metodo si occupa, ad ogni riga letta, di dividerla (tramite il separatore di elementi “,”) nella struttura dati vettore “dati” di tipo “String” in modo da fornire una posizione numerica agli elementi che lo compongono: “username” e “password” memorizzati nel file si trovano rispettivamente alle posizioni dati[3] e dati[4]. Per quanto riguarda il confronto delle password, il metodo confronta le password cifrate mentre la valutazione della coincidenza degli username avviene in chiaro.</w:t>
       </w:r>
     </w:p>
     <w:p>
@@ -1731,28 +1532,15 @@
     </w:p>
     <w:p>
       <w:r>
-        <w:t xml:space="preserve">Se entrambi i valori forniti corrispondono con quelli letti dal file, il metodo si occupa di estrarre dal vettore l’elemento </w:t>
-      </w:r>
-      <w:proofErr w:type="gramStart"/>
-      <w:r>
-        <w:t>dati[</w:t>
-      </w:r>
-      <w:proofErr w:type="gramEnd"/>
-      <w:r>
-        <w:t xml:space="preserve">0] (rappresentante il codice identificativo dell’utente) per fornirlo come parametro al metodo </w:t>
-      </w:r>
-      <w:proofErr w:type="spellStart"/>
-      <w:proofErr w:type="gramStart"/>
+        <w:t xml:space="preserve">Se entrambi i valori forniti corrispondono con quelli letti dal file, il metodo si occupa di estrarre dal vettore l’elemento dati[0] (rappresentante il codice identificativo dell’utente) per fornirlo come parametro al metodo </w:t>
+      </w:r>
+      <w:proofErr w:type="spellStart"/>
       <w:r>
         <w:t>getUtente</w:t>
       </w:r>
       <w:proofErr w:type="spellEnd"/>
       <w:r>
-        <w:t>(</w:t>
-      </w:r>
-      <w:proofErr w:type="gramEnd"/>
-      <w:r>
-        <w:t>) della classe Utente per creare un oggetto di tipo Utente, il quale verrà restituito al chiamante.</w:t>
+        <w:t>() della classe Utente per creare un oggetto di tipo Utente, il quale verrà restituito al chiamante.</w:t>
       </w:r>
     </w:p>
     <w:p>
@@ -1760,17 +1548,12 @@
         <w:t xml:space="preserve">La scelta di dividere ogni stringa del file di testo in un vettore di elementi è stata effettuata per una migliore gestione dell’oggetto: è possibile in questo modo ottenere un oggetto di tipo Utente senza istanziare ad ogni metodo chiamato tutti i campi ma inizializzandone solo uno (codice identificativo) per ottenere l’oggetto (tramite il metodo </w:t>
       </w:r>
       <w:proofErr w:type="spellStart"/>
-      <w:proofErr w:type="gramStart"/>
       <w:r>
         <w:t>getUtente</w:t>
       </w:r>
       <w:proofErr w:type="spellEnd"/>
       <w:r>
-        <w:t>(</w:t>
-      </w:r>
-      <w:proofErr w:type="gramEnd"/>
-      <w:r>
-        <w:t>) della classe Utente).</w:t>
+        <w:t>() della classe Utente).</w:t>
       </w:r>
     </w:p>
     <w:p>
@@ -2001,17 +1784,12 @@
         <w:t xml:space="preserve">Metodo </w:t>
       </w:r>
       <w:proofErr w:type="spellStart"/>
-      <w:proofErr w:type="gramStart"/>
       <w:r>
         <w:t>getProiezione</w:t>
       </w:r>
       <w:proofErr w:type="spellEnd"/>
       <w:r>
-        <w:t>(</w:t>
-      </w:r>
-      <w:proofErr w:type="gramEnd"/>
-      <w:r>
-        <w:t>)</w:t>
+        <w:t>()</w:t>
       </w:r>
     </w:p>
     <w:p>
@@ -2019,30 +1797,17 @@
         <w:t xml:space="preserve">Il metodo </w:t>
       </w:r>
       <w:proofErr w:type="spellStart"/>
-      <w:proofErr w:type="gramStart"/>
       <w:r>
         <w:t>getProiezione</w:t>
       </w:r>
       <w:proofErr w:type="spellEnd"/>
       <w:r>
-        <w:t>(</w:t>
-      </w:r>
-      <w:proofErr w:type="gramEnd"/>
-      <w:r>
-        <w:t>) è stato ideato come “sostitutivo” del costruttore per ottenere oggetti di tipo “Proiezione”. Piuttosto che inizializzare tutti i campi della classe per poi richiamare il costruttore, questo metodo riceve come unico parametro la data di una proiezione, cercando sequenzialmente nel file “Proiezioni.csv” a cui è collegato attraverso gli stream, restituisce una sola proiezione avente la data ricevuta in argomento.</w:t>
-      </w:r>
-    </w:p>
-    <w:p>
-      <w:r>
-        <w:t xml:space="preserve">Il metodo si basa sulla struttura dati vettore “dati” di tipo “String” che divide ogni stringa letta dal file “Proiezioni.csv” in elementi ogniqualvolta viene incontrato il segno di interpunzione “,”. Il metodo confronta la data di ogni proiezione memorizzata (identificata dall’elemento </w:t>
-      </w:r>
-      <w:proofErr w:type="gramStart"/>
-      <w:r>
-        <w:t>dati[</w:t>
-      </w:r>
-      <w:proofErr w:type="gramEnd"/>
-      <w:r>
-        <w:t>0]) con la data ricevuta in argomento: se le date coincidono, la ricerca viene immediatamente interrotta e l’istruzione “</w:t>
+        <w:t>() è stato ideato come “sostitutivo” del costruttore per ottenere oggetti di tipo “Proiezione”. Piuttosto che inizializzare tutti i campi della classe per poi richiamare il costruttore, questo metodo riceve come unico parametro la data di una proiezione, cercando sequenzialmente nel file “Proiezioni.csv” a cui è collegato attraverso gli stream, restituisce una sola proiezione avente la data ricevuta in argomento.</w:t>
+      </w:r>
+    </w:p>
+    <w:p>
+      <w:r>
+        <w:t>Il metodo si basa sulla struttura dati vettore “dati” di tipo “String” che divide ogni stringa letta dal file “Proiezioni.csv” in elementi ogniqualvolta viene incontrato il segno di interpunzione “,”. Il metodo confronta la data di ogni proiezione memorizzata (identificata dall’elemento dati[0]) con la data ricevuta in argomento: se le date coincidono, la ricerca viene immediatamente interrotta e l’istruzione “</w:t>
       </w:r>
       <w:proofErr w:type="spellStart"/>
       <w:r>
@@ -2074,17 +1839,12 @@
         <w:t xml:space="preserve">Metodo </w:t>
       </w:r>
       <w:proofErr w:type="spellStart"/>
-      <w:proofErr w:type="gramStart"/>
       <w:r>
         <w:t>cercaproiezione</w:t>
       </w:r>
       <w:proofErr w:type="spellEnd"/>
       <w:r>
-        <w:t>(</w:t>
-      </w:r>
-      <w:proofErr w:type="gramEnd"/>
-      <w:r>
-        <w:t>)</w:t>
+        <w:t>()</w:t>
       </w:r>
     </w:p>
     <w:p>
@@ -2092,17 +1852,12 @@
         <w:t xml:space="preserve">Il metodo </w:t>
       </w:r>
       <w:proofErr w:type="spellStart"/>
-      <w:proofErr w:type="gramStart"/>
       <w:r>
         <w:t>cercaProiezione</w:t>
       </w:r>
       <w:proofErr w:type="spellEnd"/>
       <w:r>
-        <w:t>(</w:t>
-      </w:r>
-      <w:proofErr w:type="gramEnd"/>
-      <w:r>
-        <w:t>) si occupa di creare una lista di proiezioni selezionate dal file “Proiezioni.csv” secondo un valore fornito dall’utente a uno dei criteri di ricerca disponibili, posizionati a livello dei parametri formali.</w:t>
+        <w:t>() si occupa di creare una lista di proiezioni selezionate dal file “Proiezioni.csv” secondo un valore fornito dall’utente a uno dei criteri di ricerca disponibili, posizionati a livello dei parametri formali.</w:t>
       </w:r>
     </w:p>
     <w:p>
@@ -2177,56 +1932,36 @@
         <w:t xml:space="preserve">”) è creato un nuovo oggetto di tipo “Proiezione” chiamando il costruttore e non il metodo </w:t>
       </w:r>
       <w:proofErr w:type="spellStart"/>
-      <w:proofErr w:type="gramStart"/>
       <w:r>
         <w:t>getProiezione</w:t>
       </w:r>
       <w:proofErr w:type="spellEnd"/>
       <w:r>
-        <w:t>(</w:t>
-      </w:r>
-      <w:proofErr w:type="gramEnd"/>
-      <w:r>
-        <w:t xml:space="preserve">) perché si andrebbe a incrementare notevolmente il tempo di computazione del metodo stesso: sia </w:t>
-      </w:r>
-      <w:proofErr w:type="spellStart"/>
-      <w:proofErr w:type="gramStart"/>
+        <w:t xml:space="preserve">() perché si andrebbe a incrementare notevolmente il tempo di computazione del metodo stesso: sia </w:t>
+      </w:r>
+      <w:proofErr w:type="spellStart"/>
       <w:r>
         <w:t>cercaProiezione</w:t>
       </w:r>
       <w:proofErr w:type="spellEnd"/>
       <w:r>
-        <w:t>(</w:t>
-      </w:r>
-      <w:proofErr w:type="gramEnd"/>
-      <w:r>
-        <w:t xml:space="preserve">) che </w:t>
-      </w:r>
-      <w:proofErr w:type="spellStart"/>
-      <w:proofErr w:type="gramStart"/>
+        <w:t xml:space="preserve">() che </w:t>
+      </w:r>
+      <w:proofErr w:type="spellStart"/>
       <w:r>
         <w:t>getProiezione</w:t>
       </w:r>
       <w:proofErr w:type="spellEnd"/>
       <w:r>
-        <w:t>(</w:t>
-      </w:r>
-      <w:proofErr w:type="gramEnd"/>
-      <w:r>
-        <w:t xml:space="preserve">) si basano sulla ricerca effettuata in tempo O(n), dove n è il numero di righe del file “Proiezioni.csv” (ogni riga corrisponde a una proiezione). Dovendo quindi questo metodo con complessità temporale O(n) richiamare il metodo </w:t>
-      </w:r>
-      <w:proofErr w:type="spellStart"/>
-      <w:proofErr w:type="gramStart"/>
+        <w:t xml:space="preserve">() si basano sulla ricerca effettuata in tempo O(n), dove n è il numero di righe del file “Proiezioni.csv” (ogni riga corrisponde a una proiezione). Dovendo quindi questo metodo con complessità temporale O(n) richiamare il metodo </w:t>
+      </w:r>
+      <w:proofErr w:type="spellStart"/>
       <w:r>
         <w:t>getProiezione</w:t>
       </w:r>
       <w:proofErr w:type="spellEnd"/>
       <w:r>
-        <w:t>(</w:t>
-      </w:r>
-      <w:proofErr w:type="gramEnd"/>
-      <w:r>
-        <w:t>) anch’esso con la medesima complessità, si otterrebbe il risultato della ricerca dopo aver effettuato operazioni con ordine di grandezza quadratico, cioè O(n</w:t>
+        <w:t>() anch’esso con la medesima complessità, si otterrebbe il risultato della ricerca dopo aver effettuato operazioni con ordine di grandezza quadratico, cioè O(n</w:t>
       </w:r>
       <w:r>
         <w:rPr>
@@ -2256,17 +1991,12 @@
         <w:t xml:space="preserve">La lista è stata creata al fine di essere passata in argomento al metodo </w:t>
       </w:r>
       <w:proofErr w:type="spellStart"/>
-      <w:proofErr w:type="gramStart"/>
       <w:r>
         <w:t>visualizzaProiezione</w:t>
       </w:r>
       <w:proofErr w:type="spellEnd"/>
       <w:r>
-        <w:t>(</w:t>
-      </w:r>
-      <w:proofErr w:type="gramEnd"/>
-      <w:r>
-        <w:t>) che si occupa di stampare gli elementi di “memo”.</w:t>
+        <w:t>() che si occupa di stampare gli elementi di “memo”.</w:t>
       </w:r>
     </w:p>
     <w:p>
@@ -2282,17 +2012,12 @@
         <w:t xml:space="preserve">Metodo </w:t>
       </w:r>
       <w:proofErr w:type="spellStart"/>
-      <w:proofErr w:type="gramStart"/>
       <w:r>
         <w:t>cercaProiezione</w:t>
       </w:r>
       <w:proofErr w:type="spellEnd"/>
       <w:r>
-        <w:t>(</w:t>
-      </w:r>
-      <w:proofErr w:type="gramEnd"/>
-      <w:r>
-        <w:t>) per intervallo di date</w:t>
+        <w:t>() per intervallo di date</w:t>
       </w:r>
     </w:p>
     <w:p>
@@ -2313,17 +2038,12 @@
         <w:t xml:space="preserve"> di </w:t>
       </w:r>
       <w:proofErr w:type="spellStart"/>
-      <w:proofErr w:type="gramStart"/>
       <w:r>
         <w:t>cercaProiezione</w:t>
       </w:r>
       <w:proofErr w:type="spellEnd"/>
       <w:r>
-        <w:t>(</w:t>
-      </w:r>
-      <w:proofErr w:type="gramEnd"/>
-      <w:r>
-        <w:t>) utilizza anch’esso una struttura dati vettore, denominata “dati”, di tipo String per suddividere in elementi le stringhe del file “Proiezioni.csv” e, per ogni data associata a ciascuna proiezione, controlla se rientra nell’intervallo di date, i cui estremi sono le date di inizio e fine fornite in argomento al metodo.</w:t>
+        <w:t>() utilizza anch’esso una struttura dati vettore, denominata “dati”, di tipo String per suddividere in elementi le stringhe del file “Proiezioni.csv” e, per ogni data associata a ciascuna proiezione, controlla se rientra nell’intervallo di date, i cui estremi sono le date di inizio e fine fornite in argomento al metodo.</w:t>
       </w:r>
     </w:p>
     <w:p>
@@ -2331,17 +2051,12 @@
         <w:t xml:space="preserve">Come sopra, l’ordine di grandezza temporale della ricerca è mantenuto lineare scegliendo di richiamare anche qui il costruttore al posto di </w:t>
       </w:r>
       <w:proofErr w:type="spellStart"/>
-      <w:proofErr w:type="gramStart"/>
       <w:r>
         <w:t>getProiezione</w:t>
       </w:r>
       <w:proofErr w:type="spellEnd"/>
       <w:r>
-        <w:t>(</w:t>
-      </w:r>
-      <w:proofErr w:type="gramEnd"/>
-      <w:r>
-        <w:t>) per creare gli oggetti da aggiungere alla lista sotto descritta.</w:t>
+        <w:t>() per creare gli oggetti da aggiungere alla lista sotto descritta.</w:t>
       </w:r>
     </w:p>
     <w:p>
@@ -2366,17 +2081,12 @@
         <w:t xml:space="preserve">Metodo </w:t>
       </w:r>
       <w:proofErr w:type="spellStart"/>
-      <w:proofErr w:type="gramStart"/>
       <w:r>
         <w:t>visualizzaProiezione</w:t>
       </w:r>
       <w:proofErr w:type="spellEnd"/>
       <w:r>
-        <w:t>(</w:t>
-      </w:r>
-      <w:proofErr w:type="gramEnd"/>
-      <w:r>
-        <w:t>)</w:t>
+        <w:t>()</w:t>
       </w:r>
     </w:p>
     <w:p>
@@ -2405,15 +2115,7 @@
         <w:pStyle w:val="Titolo"/>
       </w:pPr>
       <w:r>
-        <w:t>Metodi “</w:t>
-      </w:r>
-      <w:proofErr w:type="gramStart"/>
-      <w:r>
-        <w:t>getter(</w:t>
-      </w:r>
-      <w:proofErr w:type="gramEnd"/>
-      <w:r>
-        <w:t>)”</w:t>
+        <w:t>Metodi “getter()”</w:t>
       </w:r>
     </w:p>
     <w:p>
@@ -2425,17 +2127,12 @@
         </w:numPr>
       </w:pPr>
       <w:proofErr w:type="spellStart"/>
-      <w:proofErr w:type="gramStart"/>
       <w:r>
         <w:t>getDataOra</w:t>
       </w:r>
       <w:proofErr w:type="spellEnd"/>
       <w:r>
-        <w:t>(</w:t>
-      </w:r>
-      <w:proofErr w:type="gramEnd"/>
-      <w:r>
-        <w:t>)</w:t>
+        <w:t>()</w:t>
       </w:r>
       <w:r>
         <w:t>;</w:t>
@@ -2450,17 +2147,12 @@
         </w:numPr>
       </w:pPr>
       <w:proofErr w:type="spellStart"/>
-      <w:proofErr w:type="gramStart"/>
       <w:r>
         <w:t>getTitolo</w:t>
       </w:r>
       <w:proofErr w:type="spellEnd"/>
       <w:r>
-        <w:t>(</w:t>
-      </w:r>
-      <w:proofErr w:type="gramEnd"/>
-      <w:r>
-        <w:t>);</w:t>
+        <w:t>();</w:t>
       </w:r>
     </w:p>
     <w:p>
@@ -2472,17 +2164,12 @@
         </w:numPr>
       </w:pPr>
       <w:proofErr w:type="spellStart"/>
-      <w:proofErr w:type="gramStart"/>
       <w:r>
         <w:t>getGenere</w:t>
       </w:r>
       <w:proofErr w:type="spellEnd"/>
       <w:r>
-        <w:t>(</w:t>
-      </w:r>
-      <w:proofErr w:type="gramEnd"/>
-      <w:r>
-        <w:t>);</w:t>
+        <w:t>();</w:t>
       </w:r>
     </w:p>
     <w:p>
@@ -2494,17 +2181,12 @@
         </w:numPr>
       </w:pPr>
       <w:proofErr w:type="spellStart"/>
-      <w:proofErr w:type="gramStart"/>
       <w:r>
         <w:t>getRegista</w:t>
       </w:r>
       <w:proofErr w:type="spellEnd"/>
       <w:r>
-        <w:t>(</w:t>
-      </w:r>
-      <w:proofErr w:type="gramEnd"/>
-      <w:r>
-        <w:t>);</w:t>
+        <w:t>();</w:t>
       </w:r>
     </w:p>
     <w:p>
@@ -2516,17 +2198,12 @@
         </w:numPr>
       </w:pPr>
       <w:proofErr w:type="spellStart"/>
-      <w:proofErr w:type="gramStart"/>
       <w:r>
         <w:t>getAnno</w:t>
       </w:r>
       <w:proofErr w:type="spellEnd"/>
       <w:r>
-        <w:t>(</w:t>
-      </w:r>
-      <w:proofErr w:type="gramEnd"/>
-      <w:r>
-        <w:t>);</w:t>
+        <w:t>();</w:t>
       </w:r>
     </w:p>
     <w:p>
@@ -2538,17 +2215,12 @@
         </w:numPr>
       </w:pPr>
       <w:proofErr w:type="spellStart"/>
-      <w:proofErr w:type="gramStart"/>
       <w:r>
         <w:t>getDurataMinuti</w:t>
       </w:r>
       <w:proofErr w:type="spellEnd"/>
       <w:r>
-        <w:t>(</w:t>
-      </w:r>
-      <w:proofErr w:type="gramEnd"/>
-      <w:r>
-        <w:t>);</w:t>
+        <w:t>();</w:t>
       </w:r>
     </w:p>
     <w:p>
@@ -2560,17 +2232,12 @@
         </w:numPr>
       </w:pPr>
       <w:proofErr w:type="spellStart"/>
-      <w:proofErr w:type="gramStart"/>
       <w:r>
         <w:t>getEtaMinima</w:t>
       </w:r>
       <w:proofErr w:type="spellEnd"/>
       <w:r>
-        <w:t>(</w:t>
-      </w:r>
-      <w:proofErr w:type="gramEnd"/>
-      <w:r>
-        <w:t>);</w:t>
+        <w:t>();</w:t>
       </w:r>
     </w:p>
     <w:p>
@@ -2578,15 +2245,7 @@
         <w:pStyle w:val="Titolo"/>
       </w:pPr>
       <w:r>
-        <w:t>Metodi “</w:t>
-      </w:r>
-      <w:proofErr w:type="gramStart"/>
-      <w:r>
-        <w:t>setter(</w:t>
-      </w:r>
-      <w:proofErr w:type="gramEnd"/>
-      <w:r>
-        <w:t>)”</w:t>
+        <w:t>Metodi “setter()”</w:t>
       </w:r>
     </w:p>
     <w:p>
@@ -2598,17 +2257,12 @@
         </w:numPr>
       </w:pPr>
       <w:proofErr w:type="spellStart"/>
-      <w:proofErr w:type="gramStart"/>
       <w:r>
         <w:t>setDataOra</w:t>
       </w:r>
       <w:proofErr w:type="spellEnd"/>
       <w:r>
-        <w:t>(</w:t>
-      </w:r>
-      <w:proofErr w:type="gramEnd"/>
-      <w:r>
-        <w:t>);</w:t>
+        <w:t>();</w:t>
       </w:r>
     </w:p>
     <w:p>
@@ -2620,17 +2274,12 @@
         </w:numPr>
       </w:pPr>
       <w:proofErr w:type="spellStart"/>
-      <w:proofErr w:type="gramStart"/>
       <w:r>
         <w:t>setPrezzoBiglietto</w:t>
       </w:r>
       <w:proofErr w:type="spellEnd"/>
       <w:r>
-        <w:t>(</w:t>
-      </w:r>
-      <w:proofErr w:type="gramEnd"/>
-      <w:r>
-        <w:t>);</w:t>
+        <w:t>();</w:t>
       </w:r>
     </w:p>
     <w:p>
@@ -2641,17 +2290,12 @@
         <w:t xml:space="preserve">Metodo </w:t>
       </w:r>
       <w:proofErr w:type="spellStart"/>
-      <w:proofErr w:type="gramStart"/>
       <w:r>
         <w:t>toString</w:t>
       </w:r>
       <w:proofErr w:type="spellEnd"/>
       <w:r>
-        <w:t>(</w:t>
-      </w:r>
-      <w:proofErr w:type="gramEnd"/>
-      <w:r>
-        <w:t>)</w:t>
+        <w:t>()</w:t>
       </w:r>
     </w:p>
     <w:p>
@@ -2659,17 +2303,12 @@
         <w:t xml:space="preserve">Il metodo </w:t>
       </w:r>
       <w:proofErr w:type="spellStart"/>
-      <w:proofErr w:type="gramStart"/>
       <w:r>
         <w:t>toString</w:t>
       </w:r>
       <w:proofErr w:type="spellEnd"/>
       <w:r>
-        <w:t>(</w:t>
-      </w:r>
-      <w:proofErr w:type="gramEnd"/>
-      <w:r>
-        <w:t>) fornisce una rappresentazione testuale della Proiezione, sia per mostrarla all’utente, sia per essere aggiunta in coda al file “Proiezioni.csv” come una nuova proiezione.</w:t>
+        <w:t>() fornisce una rappresentazione testuale della Proiezione, sia per mostrarla all’utente, sia per essere aggiunta in coda al file “Proiezioni.csv” come una nuova proiezione.</w:t>
       </w:r>
     </w:p>
     <w:p>
@@ -2697,14 +2336,9 @@
       </w:r>
       <w:proofErr w:type="spellStart"/>
       <w:r>
-        <w:t>HH:</w:t>
-      </w:r>
-      <w:proofErr w:type="gramStart"/>
-      <w:r>
-        <w:t>mm:ss</w:t>
-      </w:r>
-      <w:proofErr w:type="spellEnd"/>
-      <w:proofErr w:type="gramEnd"/>
+        <w:t>HH:mm:ss</w:t>
+      </w:r>
+      <w:proofErr w:type="spellEnd"/>
       <w:r>
         <w:t>"</w:t>
       </w:r>
@@ -2720,17 +2354,12 @@
         <w:t xml:space="preserve">Metodo </w:t>
       </w:r>
       <w:proofErr w:type="spellStart"/>
-      <w:proofErr w:type="gramStart"/>
       <w:r>
         <w:t>equals</w:t>
       </w:r>
       <w:proofErr w:type="spellEnd"/>
       <w:r>
-        <w:t>(</w:t>
-      </w:r>
-      <w:proofErr w:type="gramEnd"/>
-      <w:r>
-        <w:t>)</w:t>
+        <w:t>()</w:t>
       </w:r>
     </w:p>
     <w:p/>
@@ -2849,17 +2478,12 @@
         <w:t xml:space="preserve">Metodo </w:t>
       </w:r>
       <w:proofErr w:type="spellStart"/>
-      <w:proofErr w:type="gramStart"/>
       <w:r>
         <w:t>registraPrenotazione</w:t>
       </w:r>
       <w:proofErr w:type="spellEnd"/>
       <w:r>
-        <w:t>(</w:t>
-      </w:r>
-      <w:proofErr w:type="gramEnd"/>
-      <w:r>
-        <w:t>)</w:t>
+        <w:t>()</w:t>
       </w:r>
     </w:p>
     <w:p>
@@ -2867,30 +2491,20 @@
         <w:t xml:space="preserve">Il metodo </w:t>
       </w:r>
       <w:proofErr w:type="spellStart"/>
-      <w:proofErr w:type="gramStart"/>
       <w:r>
         <w:t>registraPrenotazione</w:t>
       </w:r>
       <w:proofErr w:type="spellEnd"/>
       <w:r>
-        <w:t>(</w:t>
-      </w:r>
-      <w:proofErr w:type="gramEnd"/>
-      <w:r>
-        <w:t xml:space="preserve">) si occupa di memorizzare una prenotazione creata nel file “Prenotazioni.csv”. La prenotazione che si intende registrare è convertita in stringa (tramite il metodo </w:t>
-      </w:r>
-      <w:proofErr w:type="spellStart"/>
-      <w:proofErr w:type="gramStart"/>
+        <w:t xml:space="preserve">() si occupa di memorizzare una prenotazione creata nel file “Prenotazioni.csv”. La prenotazione che si intende registrare è convertita in stringa (tramite il metodo </w:t>
+      </w:r>
+      <w:proofErr w:type="spellStart"/>
       <w:r>
         <w:t>toString</w:t>
       </w:r>
       <w:proofErr w:type="spellEnd"/>
       <w:r>
-        <w:t>(</w:t>
-      </w:r>
-      <w:proofErr w:type="gramEnd"/>
-      <w:r>
-        <w:t>)), ovvero il formato testuale con cui è possibile procedere al salvataggio su file; altrimenti non sarebbe stato possibile memorizzare l’oggetto avente come tipo “Prenotazione”.</w:t>
+        <w:t>()), ovvero il formato testuale con cui è possibile procedere al salvataggio su file; altrimenti non sarebbe stato possibile memorizzare l’oggetto avente come tipo “Prenotazione”.</w:t>
       </w:r>
     </w:p>
     <w:p>
@@ -3019,17 +2633,12 @@
         </w:numPr>
       </w:pPr>
       <w:proofErr w:type="spellStart"/>
-      <w:proofErr w:type="gramStart"/>
       <w:r>
         <w:t>getCodice</w:t>
       </w:r>
       <w:proofErr w:type="spellEnd"/>
       <w:r>
-        <w:t>(</w:t>
-      </w:r>
-      <w:proofErr w:type="gramEnd"/>
-      <w:r>
-        <w:t>);</w:t>
+        <w:t>();</w:t>
       </w:r>
     </w:p>
     <w:p>
@@ -3041,17 +2650,12 @@
         </w:numPr>
       </w:pPr>
       <w:proofErr w:type="spellStart"/>
-      <w:proofErr w:type="gramStart"/>
       <w:r>
         <w:t>getUtente</w:t>
       </w:r>
       <w:proofErr w:type="spellEnd"/>
       <w:r>
-        <w:t>(</w:t>
-      </w:r>
-      <w:proofErr w:type="gramEnd"/>
-      <w:r>
-        <w:t>);</w:t>
+        <w:t>();</w:t>
       </w:r>
     </w:p>
     <w:p>
@@ -3063,17 +2667,12 @@
         </w:numPr>
       </w:pPr>
       <w:proofErr w:type="spellStart"/>
-      <w:proofErr w:type="gramStart"/>
       <w:r>
         <w:t>getProiezione</w:t>
       </w:r>
       <w:proofErr w:type="spellEnd"/>
       <w:r>
-        <w:t>(</w:t>
-      </w:r>
-      <w:proofErr w:type="gramEnd"/>
-      <w:r>
-        <w:t>);</w:t>
+        <w:t>();</w:t>
       </w:r>
     </w:p>
     <w:p>
@@ -3085,17 +2684,12 @@
         </w:numPr>
       </w:pPr>
       <w:proofErr w:type="spellStart"/>
-      <w:proofErr w:type="gramStart"/>
       <w:r>
         <w:t>getCostoTotale</w:t>
       </w:r>
       <w:proofErr w:type="spellEnd"/>
       <w:r>
-        <w:t>(</w:t>
-      </w:r>
-      <w:proofErr w:type="gramEnd"/>
-      <w:r>
-        <w:t>);</w:t>
+        <w:t>();</w:t>
       </w:r>
     </w:p>
     <w:p>
@@ -3107,26 +2701,13 @@
         </w:numPr>
       </w:pPr>
       <w:proofErr w:type="spellStart"/>
-      <w:proofErr w:type="gramStart"/>
       <w:r>
         <w:lastRenderedPageBreak/>
         <w:t>getTotaleBiglietti</w:t>
       </w:r>
       <w:proofErr w:type="spellEnd"/>
       <w:r>
-        <w:t>(</w:t>
-      </w:r>
-      <w:proofErr w:type="gramEnd"/>
-      <w:r>
-        <w:t xml:space="preserve">): il metodo si basa su un vettore denominato “dati” di tipo “String” che suddivide ciascuna riga del file “Prenotazioni.csv” in elementi separati da “,”. Questo consente di andare a confrontare l’elemento </w:t>
-      </w:r>
-      <w:proofErr w:type="gramStart"/>
-      <w:r>
-        <w:t>dati[</w:t>
-      </w:r>
-      <w:proofErr w:type="gramEnd"/>
-      <w:r>
-        <w:t>0], ovvero la data di ogni prenotazione con la data della prenotazione di cui si vuole ottenere il numero dei biglietti.</w:t>
+        <w:t>(): il metodo si basa su un vettore denominato “dati” di tipo “String” che suddivide ciascuna riga del file “Prenotazioni.csv” in elementi separati da “,”. Questo consente di andare a confrontare l’elemento dati[0], ovvero la data di ogni prenotazione con la data della prenotazione di cui si vuole ottenere il numero dei biglietti.</w:t>
       </w:r>
     </w:p>
     <w:p>
@@ -3162,17 +2743,12 @@
         </w:numPr>
       </w:pPr>
       <w:proofErr w:type="spellStart"/>
-      <w:proofErr w:type="gramStart"/>
       <w:r>
         <w:t>setProiezione</w:t>
       </w:r>
       <w:proofErr w:type="spellEnd"/>
       <w:r>
-        <w:t>(</w:t>
-      </w:r>
-      <w:proofErr w:type="gramEnd"/>
-      <w:r>
-        <w:t>);</w:t>
+        <w:t>();</w:t>
       </w:r>
     </w:p>
     <w:p>
@@ -3184,17 +2760,12 @@
         </w:numPr>
       </w:pPr>
       <w:proofErr w:type="spellStart"/>
-      <w:proofErr w:type="gramStart"/>
       <w:r>
         <w:t>setNumeroBiglietto</w:t>
       </w:r>
       <w:proofErr w:type="spellEnd"/>
       <w:r>
-        <w:t>(</w:t>
-      </w:r>
-      <w:proofErr w:type="gramEnd"/>
-      <w:r>
-        <w:t>);</w:t>
+        <w:t>();</w:t>
       </w:r>
     </w:p>
     <w:p>
@@ -3205,17 +2776,12 @@
         <w:t xml:space="preserve">Metodo </w:t>
       </w:r>
       <w:proofErr w:type="spellStart"/>
-      <w:proofErr w:type="gramStart"/>
       <w:r>
         <w:t>toString</w:t>
       </w:r>
       <w:proofErr w:type="spellEnd"/>
       <w:r>
-        <w:t>(</w:t>
-      </w:r>
-      <w:proofErr w:type="gramEnd"/>
-      <w:r>
-        <w:t>)</w:t>
+        <w:t>()</w:t>
       </w:r>
     </w:p>
     <w:p>
@@ -3223,17 +2789,12 @@
         <w:t xml:space="preserve">La classe Prenotazione dispone di un metodo </w:t>
       </w:r>
       <w:proofErr w:type="spellStart"/>
-      <w:proofErr w:type="gramStart"/>
       <w:r>
         <w:t>toString</w:t>
       </w:r>
       <w:proofErr w:type="spellEnd"/>
       <w:r>
-        <w:t>(</w:t>
-      </w:r>
-      <w:proofErr w:type="gramEnd"/>
-      <w:r>
-        <w:t>): fornisce una rappresentazione testuale di una prenotazione appena creata da memorizzare nel file “Prenotazioni.csv”, fornendo tra il valore dei campi della classe anche il valore randomico del campo “codice”; permette inoltre di visualizzare una prenotazione esistente, ricavata dal file, mostrando il valore di tutti i campi.</w:t>
+        <w:t>(): fornisce una rappresentazione testuale di una prenotazione appena creata da memorizzare nel file “Prenotazioni.csv”, fornendo tra il valore dei campi della classe anche il valore randomico del campo “codice”; permette inoltre di visualizzare una prenotazione esistente, ricavata dal file, mostrando il valore di tutti i campi.</w:t>
       </w:r>
     </w:p>
     <w:p>
@@ -3244,17 +2805,12 @@
         <w:t xml:space="preserve">Metodo </w:t>
       </w:r>
       <w:proofErr w:type="spellStart"/>
-      <w:proofErr w:type="gramStart"/>
       <w:r>
         <w:t>equals</w:t>
       </w:r>
       <w:proofErr w:type="spellEnd"/>
       <w:r>
-        <w:t>(</w:t>
-      </w:r>
-      <w:proofErr w:type="gramEnd"/>
-      <w:r>
-        <w:t>)</w:t>
+        <w:t>()</w:t>
       </w:r>
     </w:p>
     <w:p/>
@@ -3382,17 +2938,12 @@
         <w:t xml:space="preserve"> un messaggio che informa l’utente dell’inesistenza della proiezione ricercata con un valore di uno specifico parametro tramite il metodo </w:t>
       </w:r>
       <w:proofErr w:type="spellStart"/>
-      <w:proofErr w:type="gramStart"/>
       <w:r>
         <w:t>cercaPrenotazione</w:t>
       </w:r>
       <w:proofErr w:type="spellEnd"/>
       <w:r>
-        <w:t>(</w:t>
-      </w:r>
-      <w:proofErr w:type="gramEnd"/>
-      <w:r>
-        <w:t>).</w:t>
+        <w:t>().</w:t>
       </w:r>
     </w:p>
     <w:p>
@@ -3960,6 +3511,116 @@
       </w:r>
       <w:proofErr w:type="spellEnd"/>
     </w:p>
+    <w:p>
+      <w:r>
+        <w:t xml:space="preserve">La classe </w:t>
+      </w:r>
+      <w:proofErr w:type="spellStart"/>
+      <w:r>
+        <w:t>cineMax</w:t>
+      </w:r>
+      <w:proofErr w:type="spellEnd"/>
+      <w:r>
+        <w:t xml:space="preserve"> contiene il metodo </w:t>
+      </w:r>
+      <w:proofErr w:type="spellStart"/>
+      <w:r>
+        <w:t>main</w:t>
+      </w:r>
+      <w:proofErr w:type="spellEnd"/>
+      <w:r>
+        <w:t>()</w:t>
+      </w:r>
+      <w:r>
+        <w:t>, necessario all'esecuzione dell'applicazione.</w:t>
+      </w:r>
+      <w:r>
+        <w:br/>
+        <w:t>L'intera classe è composta da una serie di cicli "do-</w:t>
+      </w:r>
+      <w:proofErr w:type="spellStart"/>
+      <w:r>
+        <w:t>while</w:t>
+      </w:r>
+      <w:proofErr w:type="spellEnd"/>
+      <w:r>
+        <w:t>" e "switch-case" uno annidato nell'altro per gestire il flusso dell'esecuzione a seconda dello specifico utente che utilizza l'applicazione e delle necessità che ha nel corso dell'esecuzione.</w:t>
+      </w:r>
+      <w:r>
+        <w:br/>
+        <w:t>Nello specifico, i cicli "do-</w:t>
+      </w:r>
+      <w:proofErr w:type="spellStart"/>
+      <w:r>
+        <w:t>while</w:t>
+      </w:r>
+      <w:proofErr w:type="spellEnd"/>
+      <w:r>
+        <w:t>" consentono di ripetere un numero indefinito di iterazioni le operazioni che risiedono al loro interno, evitando di interrompersi dopo aver terminato la prima esecuzione. Ad esempio, un utente può avvalersi più volte della funzione di ricerca di una proiezione digitando il numero dell'opzione corrispondente alla stessa che viene riproposto tra le altre opzioni una volta terminato il primo ciclo di ricerca; un altro esempio è dato dalla funzione di login, la quale si ripete più volte finché l'utente non inserisce le credenziali corrette: il metodo infatti ripropone la lettura di username e password finché i co</w:t>
+      </w:r>
+      <w:r>
+        <w:t>r</w:t>
+      </w:r>
+      <w:r>
+        <w:t>rispettivi valori inseriti non corrispondono a quelli salvati nel file "</w:t>
+      </w:r>
+      <w:hyperlink r:id="rId6" w:history="1">
+        <w:r>
+          <w:rPr>
+            <w:rStyle w:val="Collegamentoipertestuale"/>
+          </w:rPr>
+          <w:t>Utenti.csv</w:t>
+        </w:r>
+      </w:hyperlink>
+      <w:r>
+        <w:t>"; o ancora, un utente che desidera ricercare una proiezione per un certo criterio di ricerca, ad esempio per titolo del film, può ripetere la ricerca senza dover ogni volta selezionare le scelte che conducono alla funzionalità di ricerca (quindi percorrendo le opzioni del menu dall'avvio alla funzione desiderata) grazie ad un ciclo "do-</w:t>
+      </w:r>
+      <w:proofErr w:type="spellStart"/>
+      <w:r>
+        <w:t>while</w:t>
+      </w:r>
+      <w:proofErr w:type="spellEnd"/>
+      <w:r>
+        <w:t>" che consente di scegliere tra ricercare, in questo caso, nuovamente per titolo, oppure compiere la ricerca per un altro criterio, e quindi tornare al menu avente a disposizione tutti i criteri.</w:t>
+      </w:r>
+      <w:r>
+        <w:br/>
+        <w:t>I costrutti "switch-case" consentono invece di individuare la co</w:t>
+      </w:r>
+      <w:r>
+        <w:t>r</w:t>
+      </w:r>
+      <w:r>
+        <w:t>retta porzione di codice (un blocco all'interno dell'istruzione "case") a seconda della scelta dell'utente (valore dell'istruzione "switch"), come nel caso della serie di funzionalità disponibili per ogni utente: i clienti possono effettuare una scelta tra prenotare dei biglietti per una proiezione; visualizzare, modificare o eliminare le proprie prenotazioni.</w:t>
+      </w:r>
+      <w:r>
+        <w:br/>
+        <w:t xml:space="preserve">In un altro blocco "case" sono presenti le funzionalità disponibili per i bigliettai: visualizzare le prenotazioni </w:t>
+      </w:r>
+      <w:r>
+        <w:lastRenderedPageBreak/>
+        <w:t>effettuate per una proiezione.</w:t>
+      </w:r>
+      <w:r>
+        <w:br/>
+        <w:t>Nell'ultimo blocco "case", invece, i proiezionisti possono creare, modificare o eliminare una proiezione tra quelle già disponibili nel file "</w:t>
+      </w:r>
+      <w:hyperlink r:id="rId7" w:history="1">
+        <w:r>
+          <w:rPr>
+            <w:rStyle w:val="Collegamentoipertestuale"/>
+          </w:rPr>
+          <w:t>Proiezioni.csv</w:t>
+        </w:r>
+      </w:hyperlink>
+      <w:r>
+        <w:t>".</w:t>
+      </w:r>
+      <w:r>
+        <w:br/>
+        <w:t>Il costrutto appena descritto è inserito come intero blocco "case" all'interno di uno "switch-case" esterno, il quale permette di gestire le funzioni di login, i menu-utente di cui sopra, la possibilità di registrazione di un nuovo utente alla piattaforma e l'opzione di ricerca delle proiezioni, oltre alla possibilità di terminare il programma senza dover ricorrere ai comandi del SO.</w:t>
+      </w:r>
+    </w:p>
     <w:p/>
     <w:p>
       <w:pPr>
@@ -4070,23 +3731,7 @@
         </w:numPr>
       </w:pPr>
       <w:r>
-        <w:t xml:space="preserve">Dire che nelle funzioni di </w:t>
-      </w:r>
-      <w:proofErr w:type="gramStart"/>
-      <w:r>
-        <w:t>modifica(</w:t>
-      </w:r>
-      <w:proofErr w:type="gramEnd"/>
-      <w:r>
-        <w:t xml:space="preserve">) e </w:t>
-      </w:r>
-      <w:proofErr w:type="gramStart"/>
-      <w:r>
-        <w:t>elimina(</w:t>
-      </w:r>
-      <w:proofErr w:type="gramEnd"/>
-      <w:r>
-        <w:t xml:space="preserve">) a volte il file viene correttamente sovrascritto, cioè che i metodi fanno giusto il loro dovere mentre altre volte viene creato e lasciato lì il file temporaneo, impossibile da eliminare e rinominare perché il SO dice che è aperto e usato da </w:t>
+        <w:t xml:space="preserve">Dire che nelle funzioni di modifica() e elimina() a volte il file viene correttamente sovrascritto, cioè che i metodi fanno giusto il loro dovere mentre altre volte viene creato e lasciato lì il file temporaneo, impossibile da eliminare e rinominare perché il SO dice che è aperto e usato da </w:t>
       </w:r>
       <w:proofErr w:type="spellStart"/>
       <w:r>
@@ -4106,7 +3751,6 @@
         </w:numPr>
       </w:pPr>
       <w:r>
-        <w:lastRenderedPageBreak/>
         <w:t>Sitografia / bibliografia</w:t>
       </w:r>
     </w:p>
@@ -4116,7 +3760,7 @@
           <w:lang w:val="en-GB"/>
         </w:rPr>
       </w:pPr>
-      <w:hyperlink r:id="rId6" w:history="1">
+      <w:hyperlink r:id="rId8" w:history="1">
         <w:r>
           <w:rPr>
             <w:rStyle w:val="Collegamentoipertestuale"/>

</xml_diff>